<commit_message>
Connect IB Navigator to secure backend, increase token limit
</commit_message>
<xml_diff>
--- a/GlobalCompass_Project_Agenda.docx
+++ b/GlobalCompass_Project_Agenda.docx
@@ -202,7 +202,7 @@
           <w:sz w:val="21"/>
           <w:szCs w:val="21"/>
         </w:rPr>
-        <w:t xml:space="preserve">•  Explained the technical setup needed: Homebrew, Node.js, Claude Code, and MCP (Model Context Protocol) connection to Claude Desktop</w:t>
+        <w:t xml:space="preserve">•  Explained the technical setup needed: Homebrew, Node.js, Claude Code, and MCP connection to Claude Desktop</w:t>
       </w:r>
     </w:p>
     <w:p>
@@ -248,21 +248,6 @@
           <w:szCs w:val="21"/>
         </w:rPr>
         <w:t xml:space="preserve">•  Claude Desktop connected with MCP — enabling direct file creation on the Mac for the first time</w:t>
-      </w:r>
-    </w:p>
-    <w:p>
-      <w:pPr>
-        <w:spacing w:after="40" w:before="40"/>
-        <w:ind w:left="360"/>
-      </w:pPr>
-      <w:r>
-        <w:rPr>
-          <w:rFonts w:ascii="Arial" w:cs="Arial" w:eastAsia="Arial" w:hAnsi="Arial"/>
-          <w:color w:val="0D1F4A"/>
-          <w:sz w:val="21"/>
-          <w:szCs w:val="21"/>
-        </w:rPr>
-        <w:t xml:space="preserve">•  Confirmed: "this chat is your planning room, Claude Desktop is your building room"</w:t>
       </w:r>
     </w:p>
     <w:p>
@@ -304,112 +289,82 @@
           <w:sz w:val="21"/>
           <w:szCs w:val="21"/>
         </w:rPr>
-        <w:t xml:space="preserve">•  Built the GlobalCompass Curriculum Finder Quiz — Quick (5 questions, free) and Deep (12 questions, Pro) versions covering 8 curricula: IB, British, American, French, German, Canadian, Australian, and Local</w:t>
-      </w:r>
-    </w:p>
-    <w:p>
-      <w:pPr>
-        <w:spacing w:after="40" w:before="40"/>
-        <w:ind w:left="360"/>
-      </w:pPr>
-      <w:r>
-        <w:rPr>
-          <w:rFonts w:ascii="Arial" w:cs="Arial" w:eastAsia="Arial" w:hAnsi="Arial"/>
-          <w:color w:val="0D1F4A"/>
-          <w:sz w:val="21"/>
-          <w:szCs w:val="21"/>
-        </w:rPr>
-        <w:t xml:space="preserve">•  Built the full GlobalCompass Business Plan — a complete 12-section Word document covering executive summary, market opportunity, 5-year scaling roadmap (UAE, Gulf, Asia, Europe, Americas), monetisation strategy, and financial projections</w:t>
-      </w:r>
-    </w:p>
-    <w:p>
-      <w:pPr>
-        <w:spacing w:after="40" w:before="40"/>
-        <w:ind w:left="360"/>
-      </w:pPr>
-      <w:r>
-        <w:rPr>
-          <w:rFonts w:ascii="Arial" w:cs="Arial" w:eastAsia="Arial" w:hAnsi="Arial"/>
-          <w:color w:val="0D1F4A"/>
-          <w:sz w:val="21"/>
-          <w:szCs w:val="21"/>
-        </w:rPr>
-        <w:t xml:space="preserve">•  Built the School Search Database — 30 real international schools across 12 countries with 8 working filters (country, city, curriculum, age, budget, language, rating, sort)</w:t>
-      </w:r>
-    </w:p>
-    <w:p>
-      <w:pPr>
-        <w:spacing w:after="40" w:before="40"/>
-        <w:ind w:left="360"/>
-      </w:pPr>
-      <w:r>
-        <w:rPr>
-          <w:rFonts w:ascii="Arial" w:cs="Arial" w:eastAsia="Arial" w:hAnsi="Arial"/>
-          <w:color w:val="0D1F4A"/>
-          <w:sz w:val="21"/>
-          <w:szCs w:val="21"/>
-        </w:rPr>
-        <w:t xml:space="preserve">•  Explained "API-ready" architecture in plain language using a restaurant menu analogy — printed menu vs live-updating screen</w:t>
-      </w:r>
-    </w:p>
-    <w:p>
-      <w:pPr>
-        <w:spacing w:after="40" w:before="40"/>
-        <w:ind w:left="360"/>
-      </w:pPr>
-      <w:r>
-        <w:rPr>
-          <w:rFonts w:ascii="Arial" w:cs="Arial" w:eastAsia="Arial" w:hAnsi="Arial"/>
-          <w:color w:val="0D1F4A"/>
-          <w:sz w:val="21"/>
-          <w:szCs w:val="21"/>
-        </w:rPr>
-        <w:t xml:space="preserve">•  Explained the 3-layer data strategy: schools self-updating their own listings, automated official feeds (KHDA, Ofsted, Google Places), and growing community reviews</w:t>
-      </w:r>
-    </w:p>
-    <w:p>
-      <w:pPr>
-        <w:spacing w:after="40" w:before="40"/>
-        <w:ind w:left="360"/>
-      </w:pPr>
-      <w:r>
-        <w:rPr>
-          <w:rFonts w:ascii="Arial" w:cs="Arial" w:eastAsia="Arial" w:hAnsi="Arial"/>
-          <w:color w:val="0D1F4A"/>
-          <w:sz w:val="21"/>
-          <w:szCs w:val="21"/>
-        </w:rPr>
-        <w:t xml:space="preserve">•  Discussed compliance groundwork: GDPR, COPPA, and UAE Personal Data Protection Law — addressed layer by layer as the platform scales, not blocking early building</w:t>
-      </w:r>
-    </w:p>
-    <w:p>
-      <w:pPr>
-        <w:spacing w:after="40" w:before="40"/>
-        <w:ind w:left="360"/>
-      </w:pPr>
-      <w:r>
-        <w:rPr>
-          <w:rFonts w:ascii="Arial" w:cs="Arial" w:eastAsia="Arial" w:hAnsi="Arial"/>
-          <w:color w:val="0D1F4A"/>
-          <w:sz w:val="21"/>
-          <w:szCs w:val="21"/>
-        </w:rPr>
-        <w:t xml:space="preserve">•  Built the full School Detail Page — tabbed profile (Overview, Fees, Curriculum, Reviews, Admissions, Contact) for Dubai International Academy as the first example</w:t>
-      </w:r>
-    </w:p>
-    <w:p>
-      <w:pPr>
-        <w:spacing w:after="40" w:before="40"/>
-        <w:ind w:left="360"/>
-      </w:pPr>
-      <w:r>
-        <w:rPr>
-          <w:rFonts w:ascii="Arial" w:cs="Arial" w:eastAsia="Arial" w:hAnsi="Arial"/>
-          <w:color w:val="0D1F4A"/>
-          <w:sz w:val="21"/>
-          <w:szCs w:val="21"/>
-        </w:rPr>
-        <w:t xml:space="preserve">•  Built and saved the first real landing page index.html — full brand identity in Antique Gold, Parchment Cream, and Warm Black, with Playfair Display and Inter typography</w:t>
+        <w:t xml:space="preserve">•  Built the GlobalCompass Curriculum Finder Quiz covering 8 curricula</w:t>
+      </w:r>
+    </w:p>
+    <w:p>
+      <w:pPr>
+        <w:spacing w:after="40" w:before="40"/>
+        <w:ind w:left="360"/>
+      </w:pPr>
+      <w:r>
+        <w:rPr>
+          <w:rFonts w:ascii="Arial" w:cs="Arial" w:eastAsia="Arial" w:hAnsi="Arial"/>
+          <w:color w:val="0D1F4A"/>
+          <w:sz w:val="21"/>
+          <w:szCs w:val="21"/>
+        </w:rPr>
+        <w:t xml:space="preserve">•  Built the full GlobalCompass Business Plan — 12-section Word document</w:t>
+      </w:r>
+    </w:p>
+    <w:p>
+      <w:pPr>
+        <w:spacing w:after="40" w:before="40"/>
+        <w:ind w:left="360"/>
+      </w:pPr>
+      <w:r>
+        <w:rPr>
+          <w:rFonts w:ascii="Arial" w:cs="Arial" w:eastAsia="Arial" w:hAnsi="Arial"/>
+          <w:color w:val="0D1F4A"/>
+          <w:sz w:val="21"/>
+          <w:szCs w:val="21"/>
+        </w:rPr>
+        <w:t xml:space="preserve">•  Built the School Search Database — 30 real international schools across 12 countries with 8 working filters</w:t>
+      </w:r>
+    </w:p>
+    <w:p>
+      <w:pPr>
+        <w:spacing w:after="40" w:before="40"/>
+        <w:ind w:left="360"/>
+      </w:pPr>
+      <w:r>
+        <w:rPr>
+          <w:rFonts w:ascii="Arial" w:cs="Arial" w:eastAsia="Arial" w:hAnsi="Arial"/>
+          <w:color w:val="0D1F4A"/>
+          <w:sz w:val="21"/>
+          <w:szCs w:val="21"/>
+        </w:rPr>
+        <w:t xml:space="preserve">•  Explained the 3-layer data strategy and compliance groundwork (GDPR, COPPA, UAE PDPL)</w:t>
+      </w:r>
+    </w:p>
+    <w:p>
+      <w:pPr>
+        <w:spacing w:after="40" w:before="40"/>
+        <w:ind w:left="360"/>
+      </w:pPr>
+      <w:r>
+        <w:rPr>
+          <w:rFonts w:ascii="Arial" w:cs="Arial" w:eastAsia="Arial" w:hAnsi="Arial"/>
+          <w:color w:val="0D1F4A"/>
+          <w:sz w:val="21"/>
+          <w:szCs w:val="21"/>
+        </w:rPr>
+        <w:t xml:space="preserve">•  Built the full School Detail Page for Dubai International Academy</w:t>
+      </w:r>
+    </w:p>
+    <w:p>
+      <w:pPr>
+        <w:spacing w:after="40" w:before="40"/>
+        <w:ind w:left="360"/>
+      </w:pPr>
+      <w:r>
+        <w:rPr>
+          <w:rFonts w:ascii="Arial" w:cs="Arial" w:eastAsia="Arial" w:hAnsi="Arial"/>
+          <w:color w:val="0D1F4A"/>
+          <w:sz w:val="21"/>
+          <w:szCs w:val="21"/>
+        </w:rPr>
+        <w:t xml:space="preserve">•  Built and saved the first real landing page index.html with full brand identity</w:t>
       </w:r>
     </w:p>
     <w:p>
@@ -451,37 +406,22 @@
           <w:sz w:val="21"/>
           <w:szCs w:val="21"/>
         </w:rPr>
-        <w:t xml:space="preserve">•  Designed a full community safety and moderation system: automated content filtering, AI moderation via Claude API, community reporting, human moderation dashboard, age-appropriate safeguards, and a clear Community Code</w:t>
-      </w:r>
-    </w:p>
-    <w:p>
-      <w:pPr>
-        <w:spacing w:after="40" w:before="40"/>
-        <w:ind w:left="360"/>
-      </w:pPr>
-      <w:r>
-        <w:rPr>
-          <w:rFonts w:ascii="Arial" w:cs="Arial" w:eastAsia="Arial" w:hAnsi="Arial"/>
-          <w:color w:val="0D1F4A"/>
-          <w:sz w:val="21"/>
-          <w:szCs w:val="21"/>
-        </w:rPr>
-        <w:t xml:space="preserve">•  Restructured the entire navigation: clean portal feel, Pro pricing moved into a popup modal (not displayed on homepage), new Final Years section introduced, Forum moved into navigation rather than homepage, Reviews separated, Universities flagged as Coming Soon</w:t>
-      </w:r>
-    </w:p>
-    <w:p>
-      <w:pPr>
-        <w:spacing w:after="40" w:before="40"/>
-        <w:ind w:left="360"/>
-      </w:pPr>
-      <w:r>
-        <w:rPr>
-          <w:rFonts w:ascii="Arial" w:cs="Arial" w:eastAsia="Arial" w:hAnsi="Arial"/>
-          <w:color w:val="0D1F4A"/>
-          <w:sz w:val="21"/>
-          <w:szCs w:val="21"/>
-        </w:rPr>
-        <w:t xml:space="preserve">•  Rebuilt index.html with the new structure — the version that introduced the now-familiar Final Years navigation concept</w:t>
+        <w:t xml:space="preserve">•  Designed a full community safety and moderation system</w:t>
+      </w:r>
+    </w:p>
+    <w:p>
+      <w:pPr>
+        <w:spacing w:after="40" w:before="40"/>
+        <w:ind w:left="360"/>
+      </w:pPr>
+      <w:r>
+        <w:rPr>
+          <w:rFonts w:ascii="Arial" w:cs="Arial" w:eastAsia="Arial" w:hAnsi="Arial"/>
+          <w:color w:val="0D1F4A"/>
+          <w:sz w:val="21"/>
+          <w:szCs w:val="21"/>
+        </w:rPr>
+        <w:t xml:space="preserve">•  Restructured the entire navigation — introduced the Final Years navigation concept</w:t>
       </w:r>
     </w:p>
     <w:p>
@@ -541,127 +481,52 @@
           <w:sz w:val="21"/>
           <w:szCs w:val="21"/>
         </w:rPr>
-        <w:t xml:space="preserve">•  Built IP protection documentation — Trademark Application materials and the Career Simulator Patent Concept document</w:t>
-      </w:r>
-    </w:p>
-    <w:p>
-      <w:pPr>
-        <w:spacing w:after="40" w:before="40"/>
-        <w:ind w:left="360"/>
-      </w:pPr>
-      <w:r>
-        <w:rPr>
-          <w:rFonts w:ascii="Arial" w:cs="Arial" w:eastAsia="Arial" w:hAnsi="Arial"/>
-          <w:color w:val="0D1F4A"/>
-          <w:sz w:val="21"/>
-          <w:szCs w:val="21"/>
-        </w:rPr>
-        <w:t xml:space="preserve">•  Built the first Product Roadmap document outlining phased development</w:t>
-      </w:r>
-    </w:p>
-    <w:p>
-      <w:pPr>
-        <w:spacing w:after="40" w:before="40"/>
-        <w:ind w:left="360"/>
-      </w:pPr>
-      <w:r>
-        <w:rPr>
-          <w:rFonts w:ascii="Arial" w:cs="Arial" w:eastAsia="Arial" w:hAnsi="Arial"/>
-          <w:color w:val="0D1F4A"/>
-          <w:sz w:val="21"/>
-          <w:szCs w:val="21"/>
-        </w:rPr>
-        <w:t xml:space="preserve">•  Introduced the Academic Passport concept for the first time — the private, curriculum-aware student grade tracker idea</w:t>
-      </w:r>
-    </w:p>
-    <w:p>
-      <w:pPr>
-        <w:spacing w:after="40" w:before="40"/>
-        <w:ind w:left="360"/>
-      </w:pPr>
-      <w:r>
-        <w:rPr>
-          <w:rFonts w:ascii="Arial" w:cs="Arial" w:eastAsia="Arial" w:hAnsi="Arial"/>
-          <w:color w:val="0D1F4A"/>
-          <w:sz w:val="21"/>
-          <w:szCs w:val="21"/>
-        </w:rPr>
-        <w:t xml:space="preserve">•  Built and deployed the Career Simulator (British A-Levels) navigator</w:t>
-      </w:r>
-    </w:p>
-    <w:p>
-      <w:pPr>
-        <w:spacing w:after="40" w:before="40"/>
-        <w:ind w:left="360"/>
-      </w:pPr>
-      <w:r>
-        <w:rPr>
-          <w:rFonts w:ascii="Arial" w:cs="Arial" w:eastAsia="Arial" w:hAnsi="Arial"/>
-          <w:color w:val="0D1F4A"/>
-          <w:sz w:val="21"/>
-          <w:szCs w:val="21"/>
-        </w:rPr>
-        <w:t xml:space="preserve">•  Built and deployed the Nursery Compass (UAE Early Years) tool</w:t>
-      </w:r>
-    </w:p>
-    <w:p>
-      <w:pPr>
-        <w:spacing w:after="40" w:before="40"/>
-        <w:ind w:left="360"/>
-      </w:pPr>
-      <w:r>
-        <w:rPr>
-          <w:rFonts w:ascii="Arial" w:cs="Arial" w:eastAsia="Arial" w:hAnsi="Arial"/>
-          <w:color w:val="0D1F4A"/>
-          <w:sz w:val="21"/>
-          <w:szCs w:val="21"/>
-        </w:rPr>
-        <w:t xml:space="preserve">•  Built and deployed the IB Pathway Navigator (Global, 180 countries)</w:t>
-      </w:r>
-    </w:p>
-    <w:p>
-      <w:pPr>
-        <w:spacing w:after="40" w:before="40"/>
-        <w:ind w:left="360"/>
-      </w:pPr>
-      <w:r>
-        <w:rPr>
-          <w:rFonts w:ascii="Arial" w:cs="Arial" w:eastAsia="Arial" w:hAnsi="Arial"/>
-          <w:color w:val="0D1F4A"/>
-          <w:sz w:val="21"/>
-          <w:szCs w:val="21"/>
-        </w:rPr>
-        <w:t xml:space="preserve">•  Built and deployed the American AP &amp; SAT Navigator with tuition savings calculator</w:t>
-      </w:r>
-    </w:p>
-    <w:p>
-      <w:pPr>
-        <w:spacing w:after="40" w:before="40"/>
-        <w:ind w:left="360"/>
-      </w:pPr>
-      <w:r>
-        <w:rPr>
-          <w:rFonts w:ascii="Arial" w:cs="Arial" w:eastAsia="Arial" w:hAnsi="Arial"/>
-          <w:color w:val="0D1F4A"/>
-          <w:sz w:val="21"/>
-          <w:szCs w:val="21"/>
-        </w:rPr>
-        <w:t xml:space="preserve">•  Built and deployed the CBSE Stream Navigator (Indian curriculum) with a family-pressure-aware guidance layer</w:t>
-      </w:r>
-    </w:p>
-    <w:p>
-      <w:pPr>
-        <w:spacing w:after="40" w:before="40"/>
-        <w:ind w:left="360"/>
-      </w:pPr>
-      <w:r>
-        <w:rPr>
-          <w:rFonts w:ascii="Arial" w:cs="Arial" w:eastAsia="Arial" w:hAnsi="Arial"/>
-          <w:color w:val="0D1F4A"/>
-          <w:sz w:val="21"/>
-          <w:szCs w:val="21"/>
-        </w:rPr>
-        <w:t xml:space="preserve">•  Built and deployed the French Baccalauréat Navigator (Nouveau Bac réforme 2021)</w:t>
+        <w:t xml:space="preserve">•  Built IP protection documentation — Trademark Application and Career Simulator Patent Concept</w:t>
+      </w:r>
+    </w:p>
+    <w:p>
+      <w:pPr>
+        <w:spacing w:after="40" w:before="40"/>
+        <w:ind w:left="360"/>
+      </w:pPr>
+      <w:r>
+        <w:rPr>
+          <w:rFonts w:ascii="Arial" w:cs="Arial" w:eastAsia="Arial" w:hAnsi="Arial"/>
+          <w:color w:val="0D1F4A"/>
+          <w:sz w:val="21"/>
+          <w:szCs w:val="21"/>
+        </w:rPr>
+        <w:t xml:space="preserve">•  Built the first Product Roadmap document</w:t>
+      </w:r>
+    </w:p>
+    <w:p>
+      <w:pPr>
+        <w:spacing w:after="40" w:before="40"/>
+        <w:ind w:left="360"/>
+      </w:pPr>
+      <w:r>
+        <w:rPr>
+          <w:rFonts w:ascii="Arial" w:cs="Arial" w:eastAsia="Arial" w:hAnsi="Arial"/>
+          <w:color w:val="0D1F4A"/>
+          <w:sz w:val="21"/>
+          <w:szCs w:val="21"/>
+        </w:rPr>
+        <w:t xml:space="preserve">•  Introduced the Academic Passport concept for the first time</w:t>
+      </w:r>
+    </w:p>
+    <w:p>
+      <w:pPr>
+        <w:spacing w:after="40" w:before="40"/>
+        <w:ind w:left="360"/>
+      </w:pPr>
+      <w:r>
+        <w:rPr>
+          <w:rFonts w:ascii="Arial" w:cs="Arial" w:eastAsia="Arial" w:hAnsi="Arial"/>
+          <w:color w:val="0D1F4A"/>
+          <w:sz w:val="21"/>
+          <w:szCs w:val="21"/>
+        </w:rPr>
+        <w:t xml:space="preserve">•  Built and deployed: Career Simulator (A-Levels), Nursery Compass, IB Pathway Navigator, American AP and SAT Navigator, CBSE Stream Navigator, French Baccalauréat Navigator</w:t>
       </w:r>
     </w:p>
     <w:p>
@@ -721,52 +586,22 @@
           <w:sz w:val="21"/>
           <w:szCs w:val="21"/>
         </w:rPr>
-        <w:t xml:space="preserve">•  Connected globalcompass.education domain — GitHub repository created, Vercel hosting configured, full deploy pipeline established (git push then auto-deploy)</w:t>
-      </w:r>
-    </w:p>
-    <w:p>
-      <w:pPr>
-        <w:spacing w:after="40" w:before="40"/>
-        <w:ind w:left="360"/>
-      </w:pPr>
-      <w:r>
-        <w:rPr>
-          <w:rFonts w:ascii="Arial" w:cs="Arial" w:eastAsia="Arial" w:hAnsi="Arial"/>
-          <w:color w:val="0D1F4A"/>
-          <w:sz w:val="21"/>
-          <w:szCs w:val="21"/>
-        </w:rPr>
-        <w:t xml:space="preserve">•  Built and deployed the Singapore Pathway Navigator — with a deliberate compassionate stress-acknowledgment layer given Singapore's academic pressure culture</w:t>
-      </w:r>
-    </w:p>
-    <w:p>
-      <w:pPr>
-        <w:spacing w:after="40" w:before="40"/>
-        <w:ind w:left="360"/>
-      </w:pPr>
-      <w:r>
-        <w:rPr>
-          <w:rFonts w:ascii="Arial" w:cs="Arial" w:eastAsia="Arial" w:hAnsi="Arial"/>
-          <w:color w:val="0D1F4A"/>
-          <w:sz w:val="21"/>
-          <w:szCs w:val="21"/>
-        </w:rPr>
-        <w:t xml:space="preserve">•  Built and deployed the German Abitur Navigator — fully bilingual German/English, with Numerus Clausus guidance</w:t>
-      </w:r>
-    </w:p>
-    <w:p>
-      <w:pPr>
-        <w:spacing w:after="40" w:before="40"/>
-        <w:ind w:left="360"/>
-      </w:pPr>
-      <w:r>
-        <w:rPr>
-          <w:rFonts w:ascii="Arial" w:cs="Arial" w:eastAsia="Arial" w:hAnsi="Arial"/>
-          <w:color w:val="0D1F4A"/>
-          <w:sz w:val="21"/>
-          <w:szCs w:val="21"/>
-        </w:rPr>
-        <w:t xml:space="preserve">•  Built and deployed the Australian VCE Navigator — covering ATAR scaling strategy and prerequisite warnings, with explicit UAE and Malaysia international-school context</w:t>
+        <w:t xml:space="preserve">•  Connected globalcompass.education domain — GitHub, Vercel, full deploy pipeline established</w:t>
+      </w:r>
+    </w:p>
+    <w:p>
+      <w:pPr>
+        <w:spacing w:after="40" w:before="40"/>
+        <w:ind w:left="360"/>
+      </w:pPr>
+      <w:r>
+        <w:rPr>
+          <w:rFonts w:ascii="Arial" w:cs="Arial" w:eastAsia="Arial" w:hAnsi="Arial"/>
+          <w:color w:val="0D1F4A"/>
+          <w:sz w:val="21"/>
+          <w:szCs w:val="21"/>
+        </w:rPr>
+        <w:t xml:space="preserve">•  Built and deployed Singapore Pathway Navigator, German Abitur Navigator, Australian VCE Navigator</w:t>
       </w:r>
     </w:p>
     <w:p>
@@ -807,7 +642,7 @@
           <w:sz w:val="18"/>
           <w:szCs w:val="18"/>
         </w:rPr>
-        <w:t xml:space="preserve">MATURITY PHASE — June 18, 2026 (Today)</w:t>
+        <w:t xml:space="preserve">MATURITY PHASE — June 18, 2026</w:t>
       </w:r>
     </w:p>
     <w:p>
@@ -841,202 +676,456 @@
           <w:sz w:val="21"/>
           <w:szCs w:val="21"/>
         </w:rPr>
-        <w:t xml:space="preserve">•  Built and deployed the Brazilian ENEM Navigator — positioned explicitly as a free "cursinho replacement" for UAE-based Brazilian families with no access to Brazil's private exam-prep culture</w:t>
-      </w:r>
-    </w:p>
-    <w:p>
-      <w:pPr>
-        <w:spacing w:after="40" w:before="40"/>
-        <w:ind w:left="360"/>
-      </w:pPr>
-      <w:r>
-        <w:rPr>
-          <w:rFonts w:ascii="Arial" w:cs="Arial" w:eastAsia="Arial" w:hAnsi="Arial"/>
-          <w:color w:val="0D1F4A"/>
-          <w:sz w:val="21"/>
-          <w:szCs w:val="21"/>
-        </w:rPr>
-        <w:t xml:space="preserve">•  Resolved a Supabase 7-day inactivity pause warning — confirmed as routine free-tier behaviour, not GlobalCompass-specific, resolved simply by logging into the dashboard</w:t>
-      </w:r>
-    </w:p>
-    <w:p>
-      <w:pPr>
-        <w:spacing w:after="40" w:before="40"/>
-        <w:ind w:left="360"/>
-      </w:pPr>
-      <w:r>
-        <w:rPr>
-          <w:rFonts w:ascii="Arial" w:cs="Arial" w:eastAsia="Arial" w:hAnsi="Arial"/>
-          <w:color w:val="0D1F4A"/>
-          <w:sz w:val="21"/>
-          <w:szCs w:val="21"/>
-        </w:rPr>
-        <w:t xml:space="preserve">•  Reconnected susselt@globalcompass.education email on the laptop after authentication issues</w:t>
-      </w:r>
-    </w:p>
-    <w:p>
-      <w:pPr>
-        <w:spacing w:after="40" w:before="40"/>
-        <w:ind w:left="360"/>
-      </w:pPr>
-      <w:r>
-        <w:rPr>
-          <w:rFonts w:ascii="Arial" w:cs="Arial" w:eastAsia="Arial" w:hAnsi="Arial"/>
-          <w:color w:val="0D1F4A"/>
-          <w:sz w:val="21"/>
-          <w:szCs w:val="21"/>
-        </w:rPr>
-        <w:t xml:space="preserve">•  Explained Stripe vs PayPal in plain terms — Stripe identified as the right future choice for subscription billing, explicitly deferred until a paid feature actually exists to sell</w:t>
-      </w:r>
-    </w:p>
-    <w:p>
-      <w:pPr>
-        <w:spacing w:after="40" w:before="40"/>
-        <w:ind w:left="360"/>
-      </w:pPr>
-      <w:r>
-        <w:rPr>
-          <w:rFonts w:ascii="Arial" w:cs="Arial" w:eastAsia="Arial" w:hAnsi="Arial"/>
-          <w:color w:val="0D1F4A"/>
-          <w:sz w:val="21"/>
-          <w:szCs w:val="21"/>
-        </w:rPr>
-        <w:t xml:space="preserve">•  Documented the founder's rural education give-back vision as a new Section 8 in the Product Roadmap — "Giving Back" — with a clear legal distinction between donating own profits (no licence needed) versus accepting public donations (requires UAE charity accreditation), and a responsible 3-stage sequence for the future</w:t>
-      </w:r>
-    </w:p>
-    <w:p>
-      <w:pPr>
-        <w:spacing w:after="40" w:before="40"/>
-        <w:ind w:left="360"/>
-      </w:pPr>
-      <w:r>
-        <w:rPr>
-          <w:rFonts w:ascii="Arial" w:cs="Arial" w:eastAsia="Arial" w:hAnsi="Arial"/>
-          <w:color w:val="0D1F4A"/>
-          <w:sz w:val="21"/>
-          <w:szCs w:val="21"/>
-        </w:rPr>
-        <w:t xml:space="preserve">•  Built the Academic Passport (IB Edition) — the first database-backed, login-protected feature on GlobalCompass</w:t>
-      </w:r>
-    </w:p>
-    <w:p>
-      <w:pPr>
-        <w:spacing w:after="40" w:before="40"/>
-        <w:ind w:left="360"/>
-      </w:pPr>
-      <w:r>
-        <w:rPr>
-          <w:rFonts w:ascii="Arial" w:cs="Arial" w:eastAsia="Arial" w:hAnsi="Arial"/>
-          <w:color w:val="0D1F4A"/>
-          <w:sz w:val="21"/>
-          <w:szCs w:val="21"/>
-        </w:rPr>
-        <w:t xml:space="preserve">•  Created Supabase database tables (ib_grades, ib_targets) with Row Level Security so each student can only ever access their own data</w:t>
-      </w:r>
-    </w:p>
-    <w:p>
-      <w:pPr>
-        <w:spacing w:after="40" w:before="40"/>
-        <w:ind w:left="360"/>
-      </w:pPr>
-      <w:r>
-        <w:rPr>
-          <w:rFonts w:ascii="Arial" w:cs="Arial" w:eastAsia="Arial" w:hAnsi="Arial"/>
-          <w:color w:val="0D1F4A"/>
-          <w:sz w:val="21"/>
-          <w:szCs w:val="21"/>
-        </w:rPr>
-        <w:t xml:space="preserve">•  Implemented passwordless email magic-link login via Supabase Auth</w:t>
-      </w:r>
-    </w:p>
-    <w:p>
-      <w:pPr>
-        <w:spacing w:after="40" w:before="40"/>
-        <w:ind w:left="360"/>
-      </w:pPr>
-      <w:r>
-        <w:rPr>
-          <w:rFonts w:ascii="Arial" w:cs="Arial" w:eastAsia="Arial" w:hAnsi="Arial"/>
-          <w:color w:val="0D1F4A"/>
-          <w:sz w:val="21"/>
-          <w:szCs w:val="21"/>
-        </w:rPr>
-        <w:t xml:space="preserve">•  Discovered and fixed a critical bug: a stale vercel.json file created on 12 June (before any navigators existed) was silently restricting Vercel to serve ONLY index.html — invisibly blocking all 13 pages including every navigator built since. Fixed by simplifying the config, restoring every page to working order</w:t>
-      </w:r>
-    </w:p>
-    <w:p>
-      <w:pPr>
-        <w:spacing w:after="40" w:before="40"/>
-        <w:ind w:left="360"/>
-      </w:pPr>
-      <w:r>
-        <w:rPr>
-          <w:rFonts w:ascii="Arial" w:cs="Arial" w:eastAsia="Arial" w:hAnsi="Arial"/>
-          <w:color w:val="0D1F4A"/>
-          <w:sz w:val="21"/>
-          <w:szCs w:val="21"/>
-        </w:rPr>
-        <w:t xml:space="preserve">•  Fixed Supabase Site URL and Redirect URL configuration (previously stuck at the default localhost:3000) so magic-link login works correctly on mobile, not just desktop</w:t>
-      </w:r>
-    </w:p>
-    <w:p>
-      <w:pPr>
-        <w:spacing w:after="40" w:before="40"/>
-        <w:ind w:left="360"/>
-      </w:pPr>
-      <w:r>
-        <w:rPr>
-          <w:rFonts w:ascii="Arial" w:cs="Arial" w:eastAsia="Arial" w:hAnsi="Arial"/>
-          <w:color w:val="0D1F4A"/>
-          <w:sz w:val="21"/>
-          <w:szCs w:val="21"/>
-        </w:rPr>
-        <w:t xml:space="preserve">•  Confirmed the Academic Passport working completely end-to-end on phone — login, grade entry, target-setting, and gap calculator all functioning</w:t>
-      </w:r>
-    </w:p>
-    <w:p>
-      <w:pPr>
-        <w:spacing w:after="40" w:before="40"/>
-        <w:ind w:left="360"/>
-      </w:pPr>
-      <w:r>
-        <w:rPr>
-          <w:rFonts w:ascii="Arial" w:cs="Arial" w:eastAsia="Arial" w:hAnsi="Arial"/>
-          <w:color w:val="0D1F4A"/>
-          <w:sz w:val="21"/>
-          <w:szCs w:val="21"/>
-        </w:rPr>
-        <w:t xml:space="preserve">•  Added Academic Passport links to both the Final Years dropdown and a prominent top-level navigation button</w:t>
-      </w:r>
-    </w:p>
-    <w:p>
-      <w:pPr>
-        <w:spacing w:after="40" w:before="40"/>
-        <w:ind w:left="360"/>
-      </w:pPr>
-      <w:r>
-        <w:rPr>
-          <w:rFonts w:ascii="Arial" w:cs="Arial" w:eastAsia="Arial" w:hAnsi="Arial"/>
-          <w:color w:val="0D1F4A"/>
-          <w:sz w:val="21"/>
-          <w:szCs w:val="21"/>
-        </w:rPr>
-        <w:t xml:space="preserve">•  Fixed a nav alignment bug caused by a duplicate wrapper div from the new button</w:t>
-      </w:r>
-    </w:p>
-    <w:p>
-      <w:pPr>
-        <w:spacing w:after="40" w:before="40"/>
-        <w:ind w:left="360"/>
-      </w:pPr>
-      <w:r>
-        <w:rPr>
-          <w:rFonts w:ascii="Arial" w:cs="Arial" w:eastAsia="Arial" w:hAnsi="Arial"/>
-          <w:color w:val="0D1F4A"/>
-          <w:sz w:val="21"/>
-          <w:szCs w:val="21"/>
-        </w:rPr>
-        <w:t xml:space="preserve">•  Opened a key strategic discussion for the Academic Passport's future: how it should scale across multiple curricula (one login, a curriculum-selector after sign-in, separate data tables per grading system) and how to name and label it clearly so its current IB-only scope is obvious to visitors — carried forward as the priority for the next working session</w:t>
+        <w:t xml:space="preserve">•  Built and deployed the Brazilian ENEM Navigator — positioned as a free "cursinho replacement"</w:t>
+      </w:r>
+    </w:p>
+    <w:p>
+      <w:pPr>
+        <w:spacing w:after="40" w:before="40"/>
+        <w:ind w:left="360"/>
+      </w:pPr>
+      <w:r>
+        <w:rPr>
+          <w:rFonts w:ascii="Arial" w:cs="Arial" w:eastAsia="Arial" w:hAnsi="Arial"/>
+          <w:color w:val="0D1F4A"/>
+          <w:sz w:val="21"/>
+          <w:szCs w:val="21"/>
+        </w:rPr>
+        <w:t xml:space="preserve">•  Resolved Supabase pause warning, reconnected laptop email, clarified Stripe vs PayPal timing</w:t>
+      </w:r>
+    </w:p>
+    <w:p>
+      <w:pPr>
+        <w:spacing w:after="40" w:before="40"/>
+        <w:ind w:left="360"/>
+      </w:pPr>
+      <w:r>
+        <w:rPr>
+          <w:rFonts w:ascii="Arial" w:cs="Arial" w:eastAsia="Arial" w:hAnsi="Arial"/>
+          <w:color w:val="0D1F4A"/>
+          <w:sz w:val="21"/>
+          <w:szCs w:val="21"/>
+        </w:rPr>
+        <w:t xml:space="preserve">•  Documented the founder's rural education give-back vision as new Section 8 of the Product Roadmap</w:t>
+      </w:r>
+    </w:p>
+    <w:p>
+      <w:pPr>
+        <w:spacing w:after="40" w:before="40"/>
+        <w:ind w:left="360"/>
+      </w:pPr>
+      <w:r>
+        <w:rPr>
+          <w:rFonts w:ascii="Arial" w:cs="Arial" w:eastAsia="Arial" w:hAnsi="Arial"/>
+          <w:color w:val="0D1F4A"/>
+          <w:sz w:val="21"/>
+          <w:szCs w:val="21"/>
+        </w:rPr>
+        <w:t xml:space="preserve">•  Built the Academic Passport (IB Edition) — first database-backed, login-protected feature</w:t>
+      </w:r>
+    </w:p>
+    <w:p>
+      <w:pPr>
+        <w:spacing w:after="40" w:before="40"/>
+        <w:ind w:left="360"/>
+      </w:pPr>
+      <w:r>
+        <w:rPr>
+          <w:rFonts w:ascii="Arial" w:cs="Arial" w:eastAsia="Arial" w:hAnsi="Arial"/>
+          <w:color w:val="0D1F4A"/>
+          <w:sz w:val="21"/>
+          <w:szCs w:val="21"/>
+        </w:rPr>
+        <w:t xml:space="preserve">•  Created Supabase tables with Row Level Security, implemented passwordless magic-link login</w:t>
+      </w:r>
+    </w:p>
+    <w:p>
+      <w:pPr>
+        <w:spacing w:after="40" w:before="40"/>
+        <w:ind w:left="360"/>
+      </w:pPr>
+      <w:r>
+        <w:rPr>
+          <w:rFonts w:ascii="Arial" w:cs="Arial" w:eastAsia="Arial" w:hAnsi="Arial"/>
+          <w:color w:val="0D1F4A"/>
+          <w:sz w:val="21"/>
+          <w:szCs w:val="21"/>
+        </w:rPr>
+        <w:t xml:space="preserve">•  Discovered and fixed a critical vercel.json bug blocking all pages except the homepage</w:t>
+      </w:r>
+    </w:p>
+    <w:p>
+      <w:pPr>
+        <w:spacing w:after="40" w:before="40"/>
+        <w:ind w:left="360"/>
+      </w:pPr>
+      <w:r>
+        <w:rPr>
+          <w:rFonts w:ascii="Arial" w:cs="Arial" w:eastAsia="Arial" w:hAnsi="Arial"/>
+          <w:color w:val="0D1F4A"/>
+          <w:sz w:val="21"/>
+          <w:szCs w:val="21"/>
+        </w:rPr>
+        <w:t xml:space="preserve">•  Fixed Supabase Site URL and Redirect URL configuration for mobile magic-link login</w:t>
+      </w:r>
+    </w:p>
+    <w:p>
+      <w:pPr>
+        <w:spacing w:after="40" w:before="40"/>
+        <w:ind w:left="360"/>
+      </w:pPr>
+      <w:r>
+        <w:rPr>
+          <w:rFonts w:ascii="Arial" w:cs="Arial" w:eastAsia="Arial" w:hAnsi="Arial"/>
+          <w:color w:val="0D1F4A"/>
+          <w:sz w:val="21"/>
+          <w:szCs w:val="21"/>
+        </w:rPr>
+        <w:t xml:space="preserve">•  Confirmed Academic Passport working end-to-end on phone</w:t>
+      </w:r>
+    </w:p>
+    <w:p>
+      <w:pPr>
+        <w:spacing w:after="40" w:before="40"/>
+        <w:ind w:left="360"/>
+      </w:pPr>
+      <w:r>
+        <w:rPr>
+          <w:rFonts w:ascii="Arial" w:cs="Arial" w:eastAsia="Arial" w:hAnsi="Arial"/>
+          <w:color w:val="0D1F4A"/>
+          <w:sz w:val="21"/>
+          <w:szCs w:val="21"/>
+        </w:rPr>
+        <w:t xml:space="preserve">•  Added Academic Passport links to navigation; opened strategic question on multi-curriculum scaling</w:t>
+      </w:r>
+    </w:p>
+    <w:p>
+      <w:pPr>
+        <w:spacing w:after="40" w:before="40"/>
+        <w:ind w:left="360"/>
+      </w:pPr>
+      <w:r>
+        <w:rPr>
+          <w:rFonts w:ascii="Arial" w:cs="Arial" w:eastAsia="Arial" w:hAnsi="Arial"/>
+          <w:color w:val="0D1F4A"/>
+          <w:sz w:val="21"/>
+          <w:szCs w:val="21"/>
+        </w:rPr>
+        <w:t xml:space="preserve">•  Built complete historical Project Agenda document covering the full journey from 9 June onward</w:t>
+      </w:r>
+    </w:p>
+    <w:p>
+      <w:pPr>
+        <w:spacing w:after="60" w:before="60"/>
+      </w:pPr>
+      <w:r>
+        <w:t xml:space="preserve"/>
+      </w:r>
+    </w:p>
+    <w:p>
+      <w:pPr>
+        <w:shd w:fill="0D1F4A" w:val="clear"/>
+        <w:spacing w:after="200" w:before="300"/>
+        <w:jc w:val="center"/>
+      </w:pPr>
+      <w:r>
+        <w:rPr>
+          <w:rFonts w:ascii="Arial" w:cs="Arial" w:eastAsia="Arial" w:hAnsi="Arial"/>
+          <w:b/>
+          <w:bCs/>
+          <w:color w:val="F5C842"/>
+          <w:sz w:val="18"/>
+          <w:szCs w:val="18"/>
+        </w:rPr>
+        <w:t xml:space="preserve">REFINEMENT PHASE — June 19, 2026 (Today)</w:t>
+      </w:r>
+    </w:p>
+    <w:p>
+      <w:pPr>
+        <w:pBdr>
+          <w:bottom w:val="single" w:color="1B3A7A" w:sz="6" w:space="6"/>
+        </w:pBdr>
+        <w:spacing w:after="140" w:before="420"/>
+      </w:pPr>
+      <w:r>
+        <w:rPr>
+          <w:rFonts w:ascii="Arial" w:cs="Arial" w:eastAsia="Arial" w:hAnsi="Arial"/>
+          <w:b/>
+          <w:bCs/>
+          <w:color w:val="1B3A7A"/>
+          <w:sz w:val="26"/>
+          <w:szCs w:val="26"/>
+        </w:rPr>
+        <w:t xml:space="preserve">19 June 2026 — Root-Cause Fixes and Quality Pass</w:t>
+      </w:r>
+    </w:p>
+    <w:p>
+      <w:pPr>
+        <w:spacing w:after="60" w:before="60"/>
+      </w:pPr>
+      <w:r>
+        <w:rPr>
+          <w:rFonts w:ascii="Arial" w:cs="Arial" w:eastAsia="Arial" w:hAnsi="Arial"/>
+          <w:color w:val="0D1F4A"/>
+          <w:sz w:val="21"/>
+          <w:szCs w:val="21"/>
+        </w:rPr>
+        <w:t xml:space="preserve">Today shifted from building new tools to a thorough quality and accuracy pass across the Final Years suite, triggered by Susselt noticing that AI results were not varying with input — a sign of deeper structural issues rather than simple content bugs.</w:t>
+      </w:r>
+    </w:p>
+    <w:p>
+      <w:pPr>
+        <w:spacing w:after="60" w:before="60"/>
+      </w:pPr>
+      <w:r>
+        <w:t xml:space="preserve"/>
+      </w:r>
+    </w:p>
+    <w:p>
+      <w:pPr>
+        <w:spacing w:after="40" w:before="40"/>
+        <w:ind w:left="360"/>
+      </w:pPr>
+      <w:r>
+        <w:rPr>
+          <w:rFonts w:ascii="Arial" w:cs="Arial" w:eastAsia="Arial" w:hAnsi="Arial"/>
+          <w:color w:val="0D1F4A"/>
+          <w:sz w:val="21"/>
+          <w:szCs w:val="21"/>
+        </w:rPr>
+        <w:t xml:space="preserve">•  Fixed a site-wide dropdown hover bug — a 4px CSS gap was causing Final Years and other nav dropdowns to close before the cursor could reach them</w:t>
+      </w:r>
+    </w:p>
+    <w:p>
+      <w:pPr>
+        <w:spacing w:after="40" w:before="40"/>
+        <w:ind w:left="360"/>
+      </w:pPr>
+      <w:r>
+        <w:rPr>
+          <w:rFonts w:ascii="Arial" w:cs="Arial" w:eastAsia="Arial" w:hAnsi="Arial"/>
+          <w:color w:val="0D1F4A"/>
+          <w:sz w:val="21"/>
+          <w:szCs w:val="21"/>
+        </w:rPr>
+        <w:t xml:space="preserve">•  Fixed the Sixth Form navigator's broken navigation link, which had been pointing to "#" instead of career-simulator.html since its creation</w:t>
+      </w:r>
+    </w:p>
+    <w:p>
+      <w:pPr>
+        <w:spacing w:after="40" w:before="40"/>
+        <w:ind w:left="360"/>
+      </w:pPr>
+      <w:r>
+        <w:rPr>
+          <w:rFonts w:ascii="Arial" w:cs="Arial" w:eastAsia="Arial" w:hAnsi="Arial"/>
+          <w:color w:val="0D1F4A"/>
+          <w:sz w:val="21"/>
+          <w:szCs w:val="21"/>
+        </w:rPr>
+        <w:t xml:space="preserve">•  Diagnosed the root cause behind frozen, repetitive AI results (always showing the same "Computer Scientist" and "$18,000" regardless of input): every navigator was calling the Anthropic API directly from the browser, which is blocked by access control checks once deployed to a real website — confirmed via browser console errors</w:t>
+      </w:r>
+    </w:p>
+    <w:p>
+      <w:pPr>
+        <w:spacing w:after="40" w:before="40"/>
+        <w:ind w:left="360"/>
+      </w:pPr>
+      <w:r>
+        <w:rPr>
+          <w:rFonts w:ascii="Arial" w:cs="Arial" w:eastAsia="Arial" w:hAnsi="Arial"/>
+          <w:color w:val="0D1F4A"/>
+          <w:sz w:val="21"/>
+          <w:szCs w:val="21"/>
+        </w:rPr>
+        <w:t xml:space="preserve">•  Created a genuine Anthropic API account (console.anthropic.com) and generated a production API key</w:t>
+      </w:r>
+    </w:p>
+    <w:p>
+      <w:pPr>
+        <w:spacing w:after="40" w:before="40"/>
+        <w:ind w:left="360"/>
+      </w:pPr>
+      <w:r>
+        <w:rPr>
+          <w:rFonts w:ascii="Arial" w:cs="Arial" w:eastAsia="Arial" w:hAnsi="Arial"/>
+          <w:color w:val="0D1F4A"/>
+          <w:sz w:val="21"/>
+          <w:szCs w:val="21"/>
+        </w:rPr>
+        <w:t xml:space="preserve">•  Built and deployed a secure Vercel serverless function (api/generate.js) so the API key stays server-side and is never exposed in browser code</w:t>
+      </w:r>
+    </w:p>
+    <w:p>
+      <w:pPr>
+        <w:spacing w:after="40" w:before="40"/>
+        <w:ind w:left="360"/>
+      </w:pPr>
+      <w:r>
+        <w:rPr>
+          <w:rFonts w:ascii="Arial" w:cs="Arial" w:eastAsia="Arial" w:hAnsi="Arial"/>
+          <w:color w:val="0D1F4A"/>
+          <w:sz w:val="21"/>
+          <w:szCs w:val="21"/>
+        </w:rPr>
+        <w:t xml:space="preserve">•  Stored the API key safely as an environment variable in Vercel settings</w:t>
+      </w:r>
+    </w:p>
+    <w:p>
+      <w:pPr>
+        <w:spacing w:after="40" w:before="40"/>
+        <w:ind w:left="360"/>
+      </w:pPr>
+      <w:r>
+        <w:rPr>
+          <w:rFonts w:ascii="Arial" w:cs="Arial" w:eastAsia="Arial" w:hAnsi="Arial"/>
+          <w:color w:val="0D1F4A"/>
+          <w:sz w:val="21"/>
+          <w:szCs w:val="21"/>
+        </w:rPr>
+        <w:t xml:space="preserve">•  Connected the American AP and SAT Navigator to the new secure backend — confirmed results now vary correctly by input</w:t>
+      </w:r>
+    </w:p>
+    <w:p>
+      <w:pPr>
+        <w:spacing w:after="40" w:before="40"/>
+        <w:ind w:left="360"/>
+      </w:pPr>
+      <w:r>
+        <w:rPr>
+          <w:rFonts w:ascii="Arial" w:cs="Arial" w:eastAsia="Arial" w:hAnsi="Arial"/>
+          <w:color w:val="0D1F4A"/>
+          <w:sz w:val="21"/>
+          <w:szCs w:val="21"/>
+        </w:rPr>
+        <w:t xml:space="preserve">•  Expanded the AP Navigator's university destination options beyond the USA to include UK, Europe, and Singapore, with the AI prompt updated to surface UK-specific admissions tests (LNAT for Law, UCAT for Medicine, ESAT/TMUA for STEM)</w:t>
+      </w:r>
+    </w:p>
+    <w:p>
+      <w:pPr>
+        <w:spacing w:after="40" w:before="40"/>
+        <w:ind w:left="360"/>
+      </w:pPr>
+      <w:r>
+        <w:rPr>
+          <w:rFonts w:ascii="Arial" w:cs="Arial" w:eastAsia="Arial" w:hAnsi="Arial"/>
+          <w:color w:val="0D1F4A"/>
+          <w:sz w:val="21"/>
+          <w:szCs w:val="21"/>
+        </w:rPr>
+        <w:t xml:space="preserve">•  Expanded the SAT Strategy Guide the same way, with honest guidance that UK universities generally do not require the SAT at all</w:t>
+      </w:r>
+    </w:p>
+    <w:p>
+      <w:pPr>
+        <w:spacing w:after="40" w:before="40"/>
+        <w:ind w:left="360"/>
+      </w:pPr>
+      <w:r>
+        <w:rPr>
+          <w:rFonts w:ascii="Arial" w:cs="Arial" w:eastAsia="Arial" w:hAnsi="Arial"/>
+          <w:color w:val="0D1F4A"/>
+          <w:sz w:val="21"/>
+          <w:szCs w:val="21"/>
+        </w:rPr>
+        <w:t xml:space="preserve">•  Diagnosed and fixed a second AP Navigator bug: longer career responses (e.g. investment banking) were being truncated mid-JSON due to an insufficient token limit, causing a silent parse failure and fallback — fixed by raising max_tokens from 1400 to 2000 and adding console logging so future failures are visible rather than silent</w:t>
+      </w:r>
+    </w:p>
+    <w:p>
+      <w:pPr>
+        <w:spacing w:after="40" w:before="40"/>
+        <w:ind w:left="360"/>
+      </w:pPr>
+      <w:r>
+        <w:rPr>
+          <w:rFonts w:ascii="Arial" w:cs="Arial" w:eastAsia="Arial" w:hAnsi="Arial"/>
+          <w:color w:val="0D1F4A"/>
+          <w:sz w:val="21"/>
+          <w:szCs w:val="21"/>
+        </w:rPr>
+        <w:t xml:space="preserve">•  Fixed the Sixth Form navigator's complete loss of styling, caused by an accidentally duplicated page header (two opening style tags, one closing) left over from an earlier build — removed the 23 duplicate lines, restoring the full visual design</w:t>
+      </w:r>
+    </w:p>
+    <w:p>
+      <w:pPr>
+        <w:spacing w:after="40" w:before="40"/>
+        <w:ind w:left="360"/>
+      </w:pPr>
+      <w:r>
+        <w:rPr>
+          <w:rFonts w:ascii="Arial" w:cs="Arial" w:eastAsia="Arial" w:hAnsi="Arial"/>
+          <w:color w:val="0D1F4A"/>
+          <w:sz w:val="21"/>
+          <w:szCs w:val="21"/>
+        </w:rPr>
+        <w:t xml:space="preserve">•  Expanded the Sixth Form navigator's UK university options beyond Russell Group alone, adding realistic tiers (Oxbridge and top tier, other Russell Group, other strong subject-specific universities such as Bath and Loughborough, and an open option), with the AI prompt updated to scale A-Level grade expectations realistically per tier rather than defaulting to Oxbridge-level demands</w:t>
+      </w:r>
+    </w:p>
+    <w:p>
+      <w:pPr>
+        <w:spacing w:after="40" w:before="40"/>
+        <w:ind w:left="360"/>
+      </w:pPr>
+      <w:r>
+        <w:rPr>
+          <w:rFonts w:ascii="Arial" w:cs="Arial" w:eastAsia="Arial" w:hAnsi="Arial"/>
+          <w:color w:val="0D1F4A"/>
+          <w:sz w:val="21"/>
+          <w:szCs w:val="21"/>
+        </w:rPr>
+        <w:t xml:space="preserve">•  Connected the Sixth Form and Brazilian ENEM navigators to the same secure backend function</w:t>
+      </w:r>
+    </w:p>
+    <w:p>
+      <w:pPr>
+        <w:spacing w:after="40" w:before="40"/>
+        <w:ind w:left="360"/>
+      </w:pPr>
+      <w:r>
+        <w:rPr>
+          <w:rFonts w:ascii="Arial" w:cs="Arial" w:eastAsia="Arial" w:hAnsi="Arial"/>
+          <w:color w:val="0D1F4A"/>
+          <w:sz w:val="21"/>
+          <w:szCs w:val="21"/>
+        </w:rPr>
+        <w:t xml:space="preserve">•  Diagnosed and fixed the Brazilian ENEM Navigator's language drift (starting in Portuguese, sliding into English) — traced to an internally inconsistent prompt that mixed English and Portuguese instructions field by field; rewritten as a fully Portuguese-first prompt with explicit instructions to remain in Brazilian Portuguese throughout every field</w:t>
+      </w:r>
+    </w:p>
+    <w:p>
+      <w:pPr>
+        <w:spacing w:after="40" w:before="40"/>
+        <w:ind w:left="360"/>
+      </w:pPr>
+      <w:r>
+        <w:rPr>
+          <w:rFonts w:ascii="Arial" w:cs="Arial" w:eastAsia="Arial" w:hAnsi="Arial"/>
+          <w:color w:val="0D1F4A"/>
+          <w:sz w:val="21"/>
+          <w:szCs w:val="21"/>
+        </w:rPr>
+        <w:t xml:space="preserve">•  Identified a navigation consistency gap: the "Back to GlobalCompass" button exists on the Brazilian ENEM navigator but is missing from the Sixth Form and American Pathway navigators — logged as a pending fix for the next session</w:t>
+      </w:r>
+    </w:p>
+    <w:p>
+      <w:pPr>
+        <w:spacing w:after="60" w:before="60"/>
+      </w:pPr>
+      <w:r>
+        <w:t xml:space="preserve"/>
+      </w:r>
+    </w:p>
+    <w:p>
+      <w:pPr>
+        <w:spacing w:after="60" w:before="60"/>
+      </w:pPr>
+      <w:r>
+        <w:rPr>
+          <w:rFonts w:ascii="Arial" w:cs="Arial" w:eastAsia="Arial" w:hAnsi="Arial"/>
+          <w:color w:val="0D1F4A"/>
+          <w:sz w:val="21"/>
+          <w:szCs w:val="21"/>
+        </w:rPr>
+        <w:t xml:space="preserve">Pending for upcoming sessions: apply the same secure-backend fix to the remaining navigators (IB, CBSE, French, Singapore, German, Australian); standardise the "Back to GlobalCompass" navigation button across all tools; fix the "Find schools / Match universities" button redirect issue on Sixth Form; broaden career and vocational options across navigators to include more modern and technical fields; general font and column UI polish; and resolve the Academic Passport's multi-curriculum scaling architecture, still open since 18 June.</w:t>
       </w:r>
     </w:p>
     <w:p>
@@ -1083,7 +1172,7 @@
           <w:sz w:val="21"/>
           <w:szCs w:val="21"/>
         </w:rPr>
-        <w:t xml:space="preserve">From a single sentence, "i want to create an app", to a live, 12-tool, database-backed education platform spanning 9 curriculum systems, all built in nine days. This document will continue to grow with each working session.</w:t>
+        <w:t xml:space="preserve">From a single sentence — "i want to create an app" — to a live, 12-tool, database-backed education platform spanning 9 curriculum systems, now being refined for real-world accuracy and trust. This document continues to grow with each working session.</w:t>
       </w:r>
     </w:p>
     <w:sectPr>

</xml_diff>

<commit_message>
Add multi-curriculum selector screen to Track My Scores
</commit_message>
<xml_diff>
--- a/GlobalCompass_Project_Agenda.docx
+++ b/GlobalCompass_Project_Agenda.docx
@@ -1680,6 +1680,383 @@
           <w:szCs w:val="20"/>
         </w:rPr>
         <w:t xml:space="preserve">  Every child deserves a compass — and soon, every system of measuring their journey will speak the same honest language.</w:t>
+      </w:r>
+    </w:p>
+    <w:p>
+      <w:pPr>
+        <w:spacing w:after="60" w:before="60"/>
+      </w:pPr>
+      <w:r>
+        <w:t xml:space="preserve"/>
+      </w:r>
+    </w:p>
+    <w:p>
+      <w:pPr>
+        <w:shd w:fill="0D1F4A" w:val="clear"/>
+        <w:spacing w:after="200" w:before="300"/>
+        <w:jc w:val="center"/>
+      </w:pPr>
+      <w:r>
+        <w:rPr>
+          <w:rFonts w:ascii="Arial" w:cs="Arial" w:eastAsia="Arial" w:hAnsi="Arial"/>
+          <w:b/>
+          <w:bCs/>
+          <w:color w:val="F5C842"/>
+          <w:sz w:val="18"/>
+          <w:szCs w:val="18"/>
+        </w:rPr>
+        <w:t xml:space="preserve">POLISH AND ACCURACY — June 22, 2026</w:t>
+      </w:r>
+    </w:p>
+    <w:p>
+      <w:pPr>
+        <w:pBdr>
+          <w:bottom w:val="single" w:color="1B3A7A" w:sz="6" w:space="6"/>
+        </w:pBdr>
+        <w:spacing w:after="140" w:before="420"/>
+      </w:pPr>
+      <w:r>
+        <w:rPr>
+          <w:rFonts w:ascii="Arial" w:cs="Arial" w:eastAsia="Arial" w:hAnsi="Arial"/>
+          <w:b/>
+          <w:bCs/>
+          <w:color w:val="1B3A7A"/>
+          <w:sz w:val="26"/>
+          <w:szCs w:val="26"/>
+        </w:rPr>
+        <w:t xml:space="preserve">22 June 2026 — Two Real Bugs Caught Through Careful Use</w:t>
+      </w:r>
+    </w:p>
+    <w:p>
+      <w:pPr>
+        <w:spacing w:after="60" w:before="60"/>
+      </w:pPr>
+      <w:r>
+        <w:rPr>
+          <w:rFonts w:ascii="Arial" w:cs="Arial" w:eastAsia="Arial" w:hAnsi="Arial"/>
+          <w:color w:val="0D1F4A"/>
+          <w:sz w:val="21"/>
+          <w:szCs w:val="21"/>
+        </w:rPr>
+        <w:t xml:space="preserve">Susselt identified two genuine issues through hands-on testing across different devices and careful reading of example content, rather than abstract review.</w:t>
+      </w:r>
+    </w:p>
+    <w:p>
+      <w:pPr>
+        <w:spacing w:after="60" w:before="60"/>
+      </w:pPr>
+      <w:r>
+        <w:t xml:space="preserve"/>
+      </w:r>
+    </w:p>
+    <w:p>
+      <w:pPr>
+        <w:spacing w:after="80" w:before="180"/>
+      </w:pPr>
+      <w:r>
+        <w:rPr>
+          <w:rFonts w:ascii="Arial" w:cs="Arial" w:eastAsia="Arial" w:hAnsi="Arial"/>
+          <w:b/>
+          <w:bCs/>
+          <w:color w:val="1B3A7A"/>
+          <w:sz w:val="22"/>
+          <w:szCs w:val="22"/>
+        </w:rPr>
+        <w:t xml:space="preserve">Computer Science career chip too narrow</w:t>
+      </w:r>
+    </w:p>
+    <w:p>
+      <w:pPr>
+        <w:spacing w:after="40" w:before="40"/>
+        <w:ind w:left="360"/>
+      </w:pPr>
+      <w:r>
+        <w:rPr>
+          <w:rFonts w:ascii="Arial" w:cs="Arial" w:eastAsia="Arial" w:hAnsi="Arial"/>
+          <w:color w:val="0D1F4A"/>
+          <w:sz w:val="21"/>
+          <w:szCs w:val="21"/>
+        </w:rPr>
+        <w:t xml:space="preserve">•  Identified that the Computer Science example chip across four navigators (American Pathway, Australian VCE, Brazilian ENEM, Singapore) was worded narrowly around artificial intelligence specifically, steering every result toward an AI career regardless of the student's actual interest within the broader field</w:t>
+      </w:r>
+    </w:p>
+    <w:p>
+      <w:pPr>
+        <w:spacing w:after="40" w:before="40"/>
+        <w:ind w:left="360"/>
+      </w:pPr>
+      <w:r>
+        <w:rPr>
+          <w:rFonts w:ascii="Arial" w:cs="Arial" w:eastAsia="Arial" w:hAnsi="Arial"/>
+          <w:color w:val="0D1F4A"/>
+          <w:sz w:val="21"/>
+          <w:szCs w:val="21"/>
+        </w:rPr>
+        <w:t xml:space="preserve">•  Broadened all four chips to genuinely reflect computer science as a field, explicitly mentioning software engineering and technology broadly alongside AI</w:t>
+      </w:r>
+    </w:p>
+    <w:p>
+      <w:pPr>
+        <w:spacing w:after="60" w:before="60"/>
+      </w:pPr>
+      <w:r>
+        <w:t xml:space="preserve"/>
+      </w:r>
+    </w:p>
+    <w:p>
+      <w:pPr>
+        <w:spacing w:after="80" w:before="180"/>
+      </w:pPr>
+      <w:r>
+        <w:rPr>
+          <w:rFonts w:ascii="Arial" w:cs="Arial" w:eastAsia="Arial" w:hAnsi="Arial"/>
+          <w:b/>
+          <w:bCs/>
+          <w:color w:val="1B3A7A"/>
+          <w:sz w:val="22"/>
+          <w:szCs w:val="22"/>
+        </w:rPr>
+        <w:t xml:space="preserve">Cross-platform flag rendering bug, properly diagnosed</w:t>
+      </w:r>
+    </w:p>
+    <w:p>
+      <w:pPr>
+        <w:spacing w:after="60" w:before="60"/>
+      </w:pPr>
+      <w:r>
+        <w:rPr>
+          <w:rFonts w:ascii="Arial" w:cs="Arial" w:eastAsia="Arial" w:hAnsi="Arial"/>
+          <w:color w:val="0D1F4A"/>
+          <w:sz w:val="21"/>
+          <w:szCs w:val="21"/>
+        </w:rPr>
+        <w:t xml:space="preserve">Susselt noticed that country flags rendered correctly on Mac but showed as plain two-letter codes (e.g. FR instead of the French flag) on an HP Windows laptop. Confirmed via research that this is a well-documented, deliberate Windows limitation: Microsoft does not include country flag emojis in its system font, reportedly to avoid the political sensitivity of choosing which flags to support, and Windows browsers fall back to showing the raw two-letter country code instead.</w:t>
+      </w:r>
+    </w:p>
+    <w:p>
+      <w:pPr>
+        <w:spacing w:after="40" w:before="40"/>
+        <w:ind w:left="360"/>
+      </w:pPr>
+      <w:r>
+        <w:rPr>
+          <w:rFonts w:ascii="Arial" w:cs="Arial" w:eastAsia="Arial" w:hAnsi="Arial"/>
+          <w:color w:val="0D1F4A"/>
+          <w:sz w:val="21"/>
+          <w:szCs w:val="21"/>
+        </w:rPr>
+        <w:t xml:space="preserve">•  First attempt: added the country-flag-emoji-polyfill library (used by companies including PostHog for this exact issue) site-wide across all 13 pages, which loads a dedicated flag-rendering font only on browsers that need it</w:t>
+      </w:r>
+    </w:p>
+    <w:p>
+      <w:pPr>
+        <w:spacing w:after="40" w:before="40"/>
+        <w:ind w:left="360"/>
+      </w:pPr>
+      <w:r>
+        <w:rPr>
+          <w:rFonts w:ascii="Arial" w:cs="Arial" w:eastAsia="Arial" w:hAnsi="Arial"/>
+          <w:color w:val="0D1F4A"/>
+          <w:sz w:val="21"/>
+          <w:szCs w:val="21"/>
+        </w:rPr>
+        <w:t xml:space="preserve">•  Initial real-device test on the HP laptop showed flags still not rendering despite the polyfill loading successfully — diagnosed methodically rather than guessing twice: confirmed via browser console that the polyfill font itself loaded correctly (document.fonts.check returned true), then confirmed via computed styles that the page's CSS never actually told the browser to use that font, since existing font-family rules (Montserrat, Inter, etc.) did not list it</w:t>
+      </w:r>
+    </w:p>
+    <w:p>
+      <w:pPr>
+        <w:spacing w:after="40" w:before="40"/>
+        <w:ind w:left="360"/>
+      </w:pPr>
+      <w:r>
+        <w:rPr>
+          <w:rFonts w:ascii="Arial" w:cs="Arial" w:eastAsia="Arial" w:hAnsi="Arial"/>
+          <w:color w:val="0D1F4A"/>
+          <w:sz w:val="21"/>
+          <w:szCs w:val="21"/>
+        </w:rPr>
+        <w:t xml:space="preserve">•  Verified the real fix live first using the browser Elements inspector to manually test a single element before committing to a site-wide change, confirming that adding the flag font as the first option in a font-family list immediately fixed that flag</w:t>
+      </w:r>
+    </w:p>
+    <w:p>
+      <w:pPr>
+        <w:spacing w:after="40" w:before="40"/>
+        <w:ind w:left="360"/>
+      </w:pPr>
+      <w:r>
+        <w:rPr>
+          <w:rFonts w:ascii="Arial" w:cs="Arial" w:eastAsia="Arial" w:hAnsi="Arial"/>
+          <w:color w:val="0D1F4A"/>
+          <w:sz w:val="21"/>
+          <w:szCs w:val="21"/>
+        </w:rPr>
+        <w:t xml:space="preserve">•  Applied the verified fix properly across all 13 files by automatically prepending the flag font to every existing font-family declaration inside each page's stylesheet, preserving all existing fonts exactly as they were for non-flag text</w:t>
+      </w:r>
+    </w:p>
+    <w:p>
+      <w:pPr>
+        <w:spacing w:after="40" w:before="40"/>
+        <w:ind w:left="360"/>
+      </w:pPr>
+      <w:r>
+        <w:rPr>
+          <w:rFonts w:ascii="Arial" w:cs="Arial" w:eastAsia="Arial" w:hAnsi="Arial"/>
+          <w:color w:val="0D1F4A"/>
+          <w:sz w:val="21"/>
+          <w:szCs w:val="21"/>
+        </w:rPr>
+        <w:t xml:space="preserve">•  Confirmed via a fresh hard-refresh test on the actual HP laptop that flags now render correctly site-wide, including in places not manually tested</w:t>
+      </w:r>
+    </w:p>
+    <w:p>
+      <w:pPr>
+        <w:spacing w:after="60" w:before="60"/>
+      </w:pPr>
+      <w:r>
+        <w:t xml:space="preserve"/>
+      </w:r>
+    </w:p>
+    <w:p>
+      <w:pPr>
+        <w:spacing w:after="60" w:before="60"/>
+      </w:pPr>
+      <w:r>
+        <w:rPr>
+          <w:rFonts w:ascii="Arial" w:cs="Arial" w:eastAsia="Arial" w:hAnsi="Arial"/>
+          <w:color w:val="0D1F4A"/>
+          <w:sz w:val="21"/>
+          <w:szCs w:val="21"/>
+        </w:rPr>
+        <w:t xml:space="preserve">Both fixes reflect a consistent pattern this week: verifying real-world behaviour on the actual affected device rather than assuming a fix works once the code looks correct, and being willing to say a previous test result was wrong rather than guessing forward from it.</w:t>
+      </w:r>
+    </w:p>
+    <w:p>
+      <w:pPr>
+        <w:spacing w:after="60" w:before="60"/>
+      </w:pPr>
+      <w:r>
+        <w:t xml:space="preserve"/>
+      </w:r>
+    </w:p>
+    <w:p>
+      <w:pPr>
+        <w:shd w:fill="EEF3FF" w:val="clear"/>
+        <w:spacing w:after="140" w:before="40"/>
+      </w:pPr>
+      <w:r>
+        <w:rPr>
+          <w:rFonts w:ascii="Arial" w:cs="Arial" w:eastAsia="Arial" w:hAnsi="Arial"/>
+          <w:i/>
+          <w:iCs/>
+          <w:color w:val="4A6FA5"/>
+          <w:sz w:val="20"/>
+          <w:szCs w:val="20"/>
+        </w:rPr>
+        <w:t xml:space="preserve">  Every child deserves a compass — rendered correctly, on every device, in every language, the first time they look.</w:t>
+      </w:r>
+    </w:p>
+    <w:p>
+      <w:pPr>
+        <w:spacing w:after="60" w:before="60"/>
+      </w:pPr>
+      <w:r>
+        <w:t xml:space="preserve"/>
+      </w:r>
+    </w:p>
+    <w:p>
+      <w:pPr>
+        <w:pBdr>
+          <w:bottom w:val="single" w:color="1B3A7A" w:sz="6" w:space="6"/>
+        </w:pBdr>
+        <w:spacing w:after="140" w:before="420"/>
+      </w:pPr>
+      <w:r>
+        <w:rPr>
+          <w:rFonts w:ascii="Arial" w:cs="Arial" w:eastAsia="Arial" w:hAnsi="Arial"/>
+          <w:b/>
+          <w:bCs/>
+          <w:color w:val="1B3A7A"/>
+          <w:sz w:val="26"/>
+          <w:szCs w:val="26"/>
+        </w:rPr>
+        <w:t xml:space="preserve">NEXT SESSION — Build Track My Scores Interface, Populate School Search</w:t>
+      </w:r>
+    </w:p>
+    <w:p>
+      <w:pPr>
+        <w:spacing w:after="60" w:before="60"/>
+      </w:pPr>
+      <w:r>
+        <w:rPr>
+          <w:rFonts w:ascii="Arial" w:cs="Arial" w:eastAsia="Arial" w:hAnsi="Arial"/>
+          <w:color w:val="0D1F4A"/>
+          <w:sz w:val="21"/>
+          <w:szCs w:val="21"/>
+        </w:rPr>
+        <w:t xml:space="preserve">Two clear goals set for the next working session:</w:t>
+      </w:r>
+    </w:p>
+    <w:p>
+      <w:pPr>
+        <w:spacing w:after="60" w:before="60"/>
+      </w:pPr>
+      <w:r>
+        <w:t xml:space="preserve"/>
+      </w:r>
+    </w:p>
+    <w:p>
+      <w:pPr>
+        <w:spacing w:after="40" w:before="40"/>
+        <w:ind w:left="360"/>
+      </w:pPr>
+      <w:r>
+        <w:rPr>
+          <w:rFonts w:ascii="Arial" w:cs="Arial" w:eastAsia="Arial" w:hAnsi="Arial"/>
+          <w:color w:val="0D1F4A"/>
+          <w:sz w:val="21"/>
+          <w:szCs w:val="21"/>
+        </w:rPr>
+        <w:t xml:space="preserve">•  Build the actual functional Track My Scores interface: the multi-curriculum selector (allowing simultaneous selection of IB, A-Levels, American Pathway, and General/Percentage as designed), the overview dashboard using the coloured initials-in-circles badge system with the gold ring accent, and the real calculation logic for A-Levels (UCAS points), American Pathway (per-subject weighted and unweighted GPA, AP exams, SAT, ACT), and General/Percentage — connecting to the database tables already built and confirmed working</w:t>
+      </w:r>
+    </w:p>
+    <w:p>
+      <w:pPr>
+        <w:spacing w:after="40" w:before="40"/>
+        <w:ind w:left="360"/>
+      </w:pPr>
+      <w:r>
+        <w:rPr>
+          <w:rFonts w:ascii="Arial" w:cs="Arial" w:eastAsia="Arial" w:hAnsi="Arial"/>
+          <w:color w:val="0D1F4A"/>
+          <w:sz w:val="21"/>
+          <w:szCs w:val="21"/>
+        </w:rPr>
+        <w:t xml:space="preserve">•  Populate the school search feature with real data so the search boxes return genuine results instead of appearing empty</w:t>
+      </w:r>
+    </w:p>
+    <w:p>
+      <w:pPr>
+        <w:spacing w:after="60" w:before="60"/>
+      </w:pPr>
+      <w:r>
+        <w:t xml:space="preserve"/>
+      </w:r>
+    </w:p>
+    <w:p>
+      <w:pPr>
+        <w:shd w:fill="EEF3FF" w:val="clear"/>
+        <w:spacing w:after="140" w:before="40"/>
+      </w:pPr>
+      <w:r>
+        <w:rPr>
+          <w:rFonts w:ascii="Arial" w:cs="Arial" w:eastAsia="Arial" w:hAnsi="Arial"/>
+          <w:i/>
+          <w:iCs/>
+          <w:color w:val="4A6FA5"/>
+          <w:sz w:val="20"/>
+          <w:szCs w:val="20"/>
+        </w:rPr>
+        <w:t xml:space="preserve">  Every child deserves a compass — and tomorrow, a working one.</w:t>
       </w:r>
     </w:p>
     <w:sectPr>

</xml_diff>